<commit_message>
release(S01): phát hành học liệu chính thức tuần mới (S01)
- Phát hành Handout, Slides, Lab Guide và câu hỏi trinh sát cho buổi S01
- Thời gian phát hành: 21h00 tối Thứ Bảy (Học viên có 1 tuần nghiên cứu trước buổi học)
- Môi trường thực hành: Docker Compose & OpenSSL 3.5
- Giảng viên phụ trách: Nguyễn An Khương (Khoa KH&KT Máy tính, Trường ĐHBK Tp. HCM)
- Trợ giảng học phần: Mr. Nguyễn Hữu Hoàng Huy (HuyLHP)

Authored-by: nakhuong <nakhuong@gmail.com>
</commit_message>
<xml_diff>
--- a/PKI-261_CAM-NANG-HOC-VIEN-TOAN-DIEN.docx
+++ b/PKI-261_CAM-NANG-HOC-VIEN-TOAN-DIEN.docx
@@ -516,7 +516,16 @@
               <w:jc w:val="left"/>
             </w:pPr>
             <w:r>
-              <w:t xml:space="preserve">triennguyen1911@gmail.com</w:t>
+              <w:t xml:space="preserve">Lớp CHAT4P (GitHub:</w:t>
+            </w:r>
+            <w:r>
+              <w:t xml:space="preserve"> </w:t>
+            </w:r>
+            <w:r>
+              <w:t xml:space="preserve">@AlexNguyen19</w:t>
+            </w:r>
+            <w:r>
+              <w:t xml:space="preserve">)</w:t>
             </w:r>
           </w:p>
         </w:tc>
@@ -3256,7 +3265,22 @@
               <w:jc w:val="left"/>
             </w:pPr>
             <w:r>
-              <w:t xml:space="preserve">AgileOps (DevOps) / An ninh mạng THD / ĐH Nguyễn Tất Thành</w:t>
+              <w:rPr>
+                <w:rStyle w:val="VerbatimChar"/>
+              </w:rPr>
+              <w:t xml:space="preserve">@hoainn</w:t>
+            </w:r>
+            <w:r>
+              <w:rPr>
+                <w:rStyle w:val="VerbatimChar"/>
+              </w:rPr>
+              <w:t xml:space="preserve">@JackkNguyen1209</w:t>
+            </w:r>
+            <w:r>
+              <w:rPr>
+                <w:rStyle w:val="VerbatimChar"/>
+              </w:rPr>
+              <w:t xml:space="preserve">@DiWien</w:t>
             </w:r>
           </w:p>
         </w:tc>
@@ -3367,7 +3391,22 @@
               <w:jc w:val="left"/>
             </w:pPr>
             <w:r>
-              <w:t xml:space="preserve">Dược Imexpharm / VinSmart Future / Cố vấn OWASP</w:t>
+              <w:rPr>
+                <w:rStyle w:val="VerbatimChar"/>
+              </w:rPr>
+              <w:t xml:space="preserve">@jerryhien</w:t>
+            </w:r>
+            <w:r>
+              <w:rPr>
+                <w:rStyle w:val="VerbatimChar"/>
+              </w:rPr>
+              <w:t xml:space="preserve">@sonnn</w:t>
+            </w:r>
+            <w:r>
+              <w:rPr>
+                <w:rStyle w:val="VerbatimChar"/>
+              </w:rPr>
+              <w:t xml:space="preserve">@crazykid95</w:t>
             </w:r>
           </w:p>
         </w:tc>
@@ -3423,7 +3462,7 @@
                 <w:b/>
                 <w:bCs/>
               </w:rPr>
-              <w:t xml:space="preserve">TMN Root of Trust</w:t>
+              <w:t xml:space="preserve">TMN</w:t>
             </w:r>
           </w:p>
         </w:tc>
@@ -3466,10 +3505,7 @@
               <w:jc w:val="center"/>
             </w:pPr>
             <w:r>
-              <w:t xml:space="preserve">ATTT</w:t>
-            </w:r>
-            <w:r>
-              <w:t xml:space="preserve">CNTT</w:t>
+              <w:t xml:space="preserve">ATTT / CNTT</w:t>
             </w:r>
           </w:p>
         </w:tc>
@@ -3481,7 +3517,22 @@
               <w:jc w:val="left"/>
             </w:pPr>
             <w:r>
-              <w:t xml:space="preserve">Ngân hàng Nam Á / Getz Pharma (Lớp trưởng) / OPSWAT</w:t>
+              <w:rPr>
+                <w:rStyle w:val="VerbatimChar"/>
+              </w:rPr>
+              <w:t xml:space="preserve">@ngayhomay</w:t>
+            </w:r>
+            <w:r>
+              <w:rPr>
+                <w:rStyle w:val="VerbatimChar"/>
+              </w:rPr>
+              <w:t xml:space="preserve">@AlexNguyen19</w:t>
+            </w:r>
+            <w:r>
+              <w:rPr>
+                <w:rStyle w:val="VerbatimChar"/>
+              </w:rPr>
+              <w:t xml:space="preserve">@chuoihat</w:t>
             </w:r>
           </w:p>
         </w:tc>
@@ -3582,9 +3633,6 @@
             <w:r>
               <w:t xml:space="preserve">CNTT</w:t>
             </w:r>
-            <w:r>
-              <w:t xml:space="preserve">THƯD</w:t>
-            </w:r>
           </w:p>
         </w:tc>
         <w:tc>
@@ -3595,7 +3643,22 @@
               <w:jc w:val="left"/>
             </w:pPr>
             <w:r>
-              <w:t xml:space="preserve">TMA Solutions / Digityze Asia / Trung tâm 286 - Bộ Tư lệnh 86</w:t>
+              <w:rPr>
+                <w:rStyle w:val="VerbatimChar"/>
+              </w:rPr>
+              <w:t xml:space="preserve">@dieuanh1511</w:t>
+            </w:r>
+            <w:r>
+              <w:rPr>
+                <w:rStyle w:val="VerbatimChar"/>
+              </w:rPr>
+              <w:t xml:space="preserve">@chidiep2312</w:t>
+            </w:r>
+            <w:r>
+              <w:rPr>
+                <w:rStyle w:val="VerbatimChar"/>
+              </w:rPr>
+              <w:t xml:space="preserve">@medvedru777</w:t>
             </w:r>
           </w:p>
         </w:tc>
@@ -3706,7 +3769,22 @@
               <w:jc w:val="left"/>
             </w:pPr>
             <w:r>
-              <w:t xml:space="preserve">Đi học / Hitachi Digital Services / Ngân hàng ACB</w:t>
+              <w:rPr>
+                <w:rStyle w:val="VerbatimChar"/>
+              </w:rPr>
+              <w:t xml:space="preserve">@vominhat</w:t>
+            </w:r>
+            <w:r>
+              <w:rPr>
+                <w:rStyle w:val="VerbatimChar"/>
+              </w:rPr>
+              <w:t xml:space="preserve">@thaisonnam</w:t>
+            </w:r>
+            <w:r>
+              <w:rPr>
+                <w:rStyle w:val="VerbatimChar"/>
+              </w:rPr>
+              <w:t xml:space="preserve">@nguyencongy</w:t>
             </w:r>
           </w:p>
         </w:tc>

</xml_diff>